<commit_message>
docs(gravedad-comercio-bilateral-peru): ficha tecnica, nota ejecutiva y referencias verificadas
Agrega la ficha tecnica (docs/data-contracts), una nota ejecutiva en
lenguaje llano, y la verificacion en vivo de las 4 referencias academicas
del paper (DOI confirmados contra AEA, REStat/MIT Press, CEPII y Google
Books/Cambridge Core). Entrada en docs/conectores.md marcando el proyecto
como analisis derivado, no conector nuevo.
</commit_message>
<xml_diff>
--- a/investigaciones/gravedad-comercio-bilateral-peru/paper/Paper-Gravedad-Comercio-Bilateral-Peru-2015-2024.docx
+++ b/investigaciones/gravedad-comercio-bilateral-peru/paper/Paper-Gravedad-Comercio-Bilateral-Peru-2015-2024.docx
@@ -3884,6 +3884,14 @@
     </w:p>
     <w:p>
       <w:pPr>
+        <w:pStyle w:val="Body"/>
+      </w:pPr>
+      <w:r>
+        <w:t>DOI: [10.1257/000282803321455214](https://doi.org/10.1257/000282803321455214)</w:t>
+      </w:r>
+    </w:p>
+    <w:p>
+      <w:pPr>
         <w:pStyle w:val="Bullet"/>
         <w:ind w:left="400" w:hanging="280"/>
       </w:pPr>
@@ -3901,6 +3909,14 @@
     </w:p>
     <w:p>
       <w:pPr>
+        <w:pStyle w:val="Body"/>
+      </w:pPr>
+      <w:r>
+        <w:t>DOI: [10.1162/rest.88.4.641](https://doi.org/10.1162/rest.88.4.641)</w:t>
+      </w:r>
+    </w:p>
+    <w:p>
+      <w:pPr>
         <w:pStyle w:val="Bullet"/>
         <w:ind w:left="400" w:hanging="280"/>
       </w:pPr>
@@ -3913,7 +3929,7 @@
         <w:pStyle w:val="Body"/>
       </w:pPr>
       <w:r>
-        <w:t>International Economic Policy*. Twentieth Century Fund.</w:t>
+        <w:t>International Economic Policy*. Twentieth Century Fund, Nueva York, 330 pp.</w:t>
       </w:r>
     </w:p>
     <w:p>
@@ -3930,7 +3946,15 @@
         <w:pStyle w:val="Body"/>
       </w:pPr>
       <w:r>
-        <w:t>Cookbook. CEPII, Handbook of International Economics, 4, 131-195.</w:t>
+        <w:t>Cookbook. En Handbook of International Economics, Vol. 4, pp. 131-195.</w:t>
+      </w:r>
+    </w:p>
+    <w:p>
+      <w:pPr>
+        <w:pStyle w:val="Body"/>
+      </w:pPr>
+      <w:r>
+        <w:t>Elsevier. DOI: [10.1016/B978-0-444-54314-1.00003-3](https://doi.org/10.1016/B978-0-444-54314-1.00003-3)</w:t>
       </w:r>
     </w:p>
     <w:p>
@@ -3952,11 +3976,56 @@
     </w:p>
     <w:p>
       <w:pPr>
+        <w:pStyle w:val="Body"/>
+      </w:pPr>
+      <w:r>
+        <w:t>[cepii.fr](https://www.cepii.fr/)</w:t>
+      </w:r>
+    </w:p>
+    <w:p>
+      <w:pPr>
         <w:pStyle w:val="Bullet"/>
         <w:ind w:left="400" w:hanging="280"/>
       </w:pPr>
       <w:r>
-        <w:t>•  World Bank, World Development Indicators, NY.GDP.MKTP.CD.</w:t>
+        <w:t>•  World Bank, World Development Indicators, NY.GDP.MKTP.CD (PBI corriente,</w:t>
+      </w:r>
+    </w:p>
+    <w:p>
+      <w:pPr>
+        <w:pStyle w:val="Body"/>
+      </w:pPr>
+      <w:r>
+        <w:t>US$). [databank.worldbank.org/source/world-development-indicators](https://databank.worldbank.org/source/world-development-indicators)</w:t>
+      </w:r>
+    </w:p>
+    <w:p>
+      <w:pPr>
+        <w:spacing w:after="40"/>
+      </w:pPr>
+    </w:p>
+    <w:p>
+      <w:pPr>
+        <w:pStyle w:val="Body"/>
+      </w:pPr>
+      <w:r>
+        <w:t>Las 4 referencias académicas fueron verificadas en vivo contra fuentes</w:t>
+      </w:r>
+    </w:p>
+    <w:p>
+      <w:pPr>
+        <w:pStyle w:val="Body"/>
+      </w:pPr>
+      <w:r>
+        <w:t>primarias el 2026-10-18 (ver referencias_verificadas.md en la raíz de este</w:t>
+      </w:r>
+    </w:p>
+    <w:p>
+      <w:pPr>
+        <w:pStyle w:val="Body"/>
+      </w:pPr>
+      <w:r>
+        <w:t>proyecto para el detalle de la verificación).</w:t>
       </w:r>
     </w:p>
     <w:p>

</xml_diff>

<commit_message>
feat(gravedad-comercio-bilateral-peru): modelo simetrico de importaciones + nuevo titulo
Repite el procedimiento de gravedad (crudo -> sin commodities -> sin hubs)
del lado importador. Hallazgo: el mismo filtro que corrige la distancia en
exportaciones (-0.58) NO la corrige en importaciones (+0.90, p<0.001) --
verificado que no es el mismo artefacto (residuos apuntan a Argentina y
Bolivia, vecinos reales, no hubs de transito; China/Alemania/Japon/Corea
dominan genuinamente la canasta importadora).

Titulo del paper actualizado a registro economico-narrativo (no
econometrico): "Por que la distancia explica lo que Peru exporta pero no
lo que importa". Notebook extendido (18 celdas, 0 errores), ficha tecnica
y README actualizados para cubrir ambos lados del panel.
</commit_message>
<xml_diff>
--- a/investigaciones/gravedad-comercio-bilateral-peru/paper/Paper-Gravedad-Comercio-Bilateral-Peru-2015-2024.docx
+++ b/investigaciones/gravedad-comercio-bilateral-peru/paper/Paper-Gravedad-Comercio-Bilateral-Peru-2015-2024.docx
@@ -8,7 +8,7 @@
         <w:spacing w:before="960"/>
       </w:pPr>
       <w:r>
-        <w:t>Gravedad del comercio bilateral peruano, 2015-2024: el sesgo de los commodities y los hubs de reexportación</w:t>
+        <w:t>Por qué la distancia explica lo que Perú exporta pero no lo que importa: el espejismo del oro, el cobre y el peso de la manufactura asiática</w:t>
       </w:r>
     </w:p>
     <w:p>
@@ -190,7 +190,7 @@
         <w:pStyle w:val="Body"/>
       </w:pPr>
       <w:r>
-        <w:t>relevante: el efecto aparentemente significativo de los acuerdos comerciales</w:t>
+        <w:t>relevante: la asociación aparente de los acuerdos comerciales con el comercio</w:t>
       </w:r>
     </w:p>
     <w:p>
@@ -214,7 +214,7 @@
         <w:pStyle w:val="Body"/>
       </w:pPr>
       <w:r>
-        <w:t>espuria con los grandes compradores de metales y gas, no un efecto causal de</w:t>
+        <w:t>espuria con los grandes compradores de metales y gas, no una relación propia</w:t>
       </w:r>
     </w:p>
     <w:p>
@@ -222,7 +222,47 @@
         <w:pStyle w:val="Body"/>
       </w:pPr>
       <w:r>
-        <w:t>los acuerdos sobre el comercio no-commodity.</w:t>
+        <w:t>de los acuerdos con el comercio no-commodity. Al repetir el ejercicio del</w:t>
+      </w:r>
+    </w:p>
+    <w:p>
+      <w:pPr>
+        <w:pStyle w:val="Body"/>
+      </w:pPr>
+      <w:r>
+        <w:t>lado importador, la asimetría es reveladora: el mismo filtro de commodities y</w:t>
+      </w:r>
+    </w:p>
+    <w:p>
+      <w:pPr>
+        <w:pStyle w:val="Body"/>
+      </w:pPr>
+      <w:r>
+        <w:t>hubs que corrige la distancia en las exportaciones no corrige el signo en</w:t>
+      </w:r>
+    </w:p>
+    <w:p>
+      <w:pPr>
+        <w:pStyle w:val="Body"/>
+      </w:pPr>
+      <w:r>
+        <w:t>las importaciones (+0.90, p&lt;0.001) — porque ahí no hay artefacto de medición</w:t>
+      </w:r>
+    </w:p>
+    <w:p>
+      <w:pPr>
+        <w:pStyle w:val="Body"/>
+      </w:pPr>
+      <w:r>
+        <w:t>que corregir: China, Alemania, Japón y Corea, todas economías manufactureras</w:t>
+      </w:r>
+    </w:p>
+    <w:p>
+      <w:pPr>
+        <w:pStyle w:val="Body"/>
+      </w:pPr>
+      <w:r>
+        <w:t>lejanas, dominan genuinamente la canasta importadora peruana.</w:t>
       </w:r>
     </w:p>
     <w:p>
@@ -437,7 +477,7 @@
         <w:pStyle w:val="Body"/>
       </w:pPr>
       <w:r>
-        <w:t>Se construyó un panel de 224 socios comerciales × 10 años (2015-2024) a</w:t>
+        <w:t>Se construyeron dos paneles espejo de 224 socios comerciales × 10 años</w:t>
       </w:r>
     </w:p>
     <w:p>
@@ -445,7 +485,7 @@
         <w:pStyle w:val="Body"/>
       </w:pPr>
       <w:r>
-        <w:t>partir de las siguientes fuentes, cargadas en una base Neon/PostgreSQL</w:t>
+        <w:t>(2015-2024) — uno con las exportaciones de Perú hacia cada socio, otro con</w:t>
       </w:r>
     </w:p>
     <w:p>
@@ -453,7 +493,15 @@
         <w:pStyle w:val="Body"/>
       </w:pPr>
       <w:r>
-        <w:t>(bcrp_comercio_exterior):</w:t>
+        <w:t>las importaciones de Perú desde cada socio — a partir de las siguientes</w:t>
+      </w:r>
+    </w:p>
+    <w:p>
+      <w:pPr>
+        <w:pStyle w:val="Body"/>
+      </w:pPr>
+      <w:r>
+        <w:t>fuentes, cargadas en una base Neon/PostgreSQL (bcrp_comercio_exterior):</w:t>
       </w:r>
     </w:p>
     <w:p>
@@ -813,7 +861,7 @@
         <w:pStyle w:val="Body"/>
       </w:pPr>
       <w:r>
-        <w:t>La variable dependiente es el valor total exportado por Perú a cada socio en</w:t>
+        <w:t>La variable dependiente es el valor exportado (sección 4) o importado</w:t>
       </w:r>
     </w:p>
     <w:p>
@@ -821,7 +869,7 @@
         <w:pStyle w:val="Body"/>
       </w:pPr>
       <w:r>
-        <w:t>cada año, en millones de USD. A diferencia de una extracción típica que</w:t>
+        <w:t>(sección 5) por Perú con cada socio en cada año, en millones de USD. A</w:t>
       </w:r>
     </w:p>
     <w:p>
@@ -829,7 +877,7 @@
         <w:pStyle w:val="Body"/>
       </w:pPr>
       <w:r>
-        <w:t>trabaja solo con los años en que hubo comercio registrado, el panel incluye</w:t>
+        <w:t>diferencia de una extracción típica que trabaja solo con los años en que</w:t>
       </w:r>
     </w:p>
     <w:p>
@@ -837,7 +885,7 @@
         <w:pStyle w:val="Body"/>
       </w:pPr>
       <w:r>
-        <w:t>los ceros reales: la ausencia de una fila en BACI para un par país-año se</w:t>
+        <w:t>hubo comercio registrado, ambos paneles incluyen los ceros reales: la</w:t>
       </w:r>
     </w:p>
     <w:p>
@@ -845,7 +893,7 @@
         <w:pStyle w:val="Body"/>
       </w:pPr>
       <w:r>
-        <w:t>interpreta como cero comercio ese año, no como dato faltante — PPML explota</w:t>
+        <w:t>ausencia de una fila en BACI para un par país-año se interpreta como cero</w:t>
       </w:r>
     </w:p>
     <w:p>
@@ -853,7 +901,7 @@
         <w:pStyle w:val="Body"/>
       </w:pPr>
       <w:r>
-        <w:t>precisamente esta información, que un modelo log-lineal por MCO tendría que</w:t>
+        <w:t>comercio ese año, no como dato faltante — PPML explota precisamente esta</w:t>
       </w:r>
     </w:p>
     <w:p>
@@ -861,7 +909,7 @@
         <w:pStyle w:val="Body"/>
       </w:pPr>
       <w:r>
-        <w:t>descartar.</w:t>
+        <w:t>información, que un modelo log-lineal por MCO tendría que descartar.</w:t>
       </w:r>
     </w:p>
     <w:p>
@@ -902,7 +950,15 @@
         <w:pStyle w:val="Body"/>
       </w:pPr>
       <w:r>
-        <w:t>Se estima, por año y variantes de la variable dependiente:</w:t>
+        <w:t>Se estima, por año, dirección del flujo (exporta/importa) y variantes de la</w:t>
+      </w:r>
+    </w:p>
+    <w:p>
+      <w:pPr>
+        <w:pStyle w:val="Body"/>
+      </w:pPr>
+      <w:r>
+        <w:t>variable dependiente:</w:t>
       </w:r>
     </w:p>
     <w:p>
@@ -916,9 +972,9 @@
           <w:rFonts w:ascii="Consolas" w:hAnsi="Consolas"/>
           <w:sz w:val="18"/>
         </w:rPr>
-        <w:t>exporta_ij,t = exp(β₁·log(PBI_j,t) + β₂·log(dist_ij) + β₃·frontera_ij</w:t>
+        <w:t>flujo_ij,t = exp(β₁·log(PBI_j,t) + β₂·log(dist_ij) + β₃·frontera_ij</w:t>
         <w:br/>
-        <w:t xml:space="preserve">                    + β₄·idioma_ij + β₅·colonia_ij + β₆·acuerdo_ij,t + γ_t) + ε_ij,t</w:t>
+        <w:t xml:space="preserve">                  + β₄·idioma_ij + β₅·colonia_ij + β₆·acuerdo_ij,t + γ_t) + ε_ij,t</w:t>
       </w:r>
     </w:p>
     <w:p>
@@ -947,7 +1003,7 @@
         <w:pStyle w:val="Body"/>
       </w:pPr>
       <w:r>
-        <w:t>exportador (PBI o población de Perú) no se incluye como regresor explícito:</w:t>
+        <w:t>peruano (PBI o población de Perú) no se incluye como regresor explícito en</w:t>
       </w:r>
     </w:p>
     <w:p>
@@ -955,7 +1011,7 @@
         <w:pStyle w:val="Body"/>
       </w:pPr>
       <w:r>
-        <w:t>como Perú es el único exportador del panel, esas variables no varían entre</w:t>
+        <w:t>ninguna de las dos direcciones: como Perú es el único reportador del panel</w:t>
       </w:r>
     </w:p>
     <w:p>
@@ -963,7 +1019,7 @@
         <w:pStyle w:val="Body"/>
       </w:pPr>
       <w:r>
-        <w:t>socios dentro de un mismo año y son perfectamente colineales con los efectos</w:t>
+        <w:t>(exportador en la sección 4, importador en la sección 5), esas variables no</w:t>
       </w:r>
     </w:p>
     <w:p>
@@ -971,7 +1027,7 @@
         <w:pStyle w:val="Body"/>
       </w:pPr>
       <w:r>
-        <w:t>fijos de año, que ya las absorben — es la forma estándar de controlar por</w:t>
+        <w:t>varían entre socios dentro de un mismo año y son perfectamente colineales con</w:t>
       </w:r>
     </w:p>
     <w:p>
@@ -979,7 +1035,7 @@
         <w:pStyle w:val="Body"/>
       </w:pPr>
       <w:r>
-        <w:t>"resistencia multilateral" del lado exportador en un panel de un solo</w:t>
+        <w:t>los efectos fijos de año, que ya las absorben — es la forma estándar de</w:t>
       </w:r>
     </w:p>
     <w:p>
@@ -987,7 +1043,15 @@
         <w:pStyle w:val="Body"/>
       </w:pPr>
       <w:r>
-        <w:t>exportador.</w:t>
+        <w:t>controlar por "resistencia multilateral" del lado peruano en un panel de un</w:t>
+      </w:r>
+    </w:p>
+    <w:p>
+      <w:pPr>
+        <w:pStyle w:val="Body"/>
+      </w:pPr>
+      <w:r>
+        <w:t>solo reportador.</w:t>
       </w:r>
     </w:p>
     <w:p>
@@ -1007,7 +1071,7 @@
           <w:color w:val="FFFFFF"/>
           <w:sz w:val="22"/>
         </w:rPr>
-        <w:t>4. Resultados</w:t>
+        <w:t>4. Resultados — exportaciones</w:t>
       </w:r>
     </w:p>
     <w:p>
@@ -3494,7 +3558,7 @@
           <w:color w:val="FFFFFF"/>
           <w:sz w:val="22"/>
         </w:rPr>
-        <w:t>5. Discusión</w:t>
+        <w:t>5. Resultados — importaciones</w:t>
       </w:r>
     </w:p>
     <w:p>
@@ -3515,7 +3579,7 @@
         <w:pStyle w:val="Body"/>
       </w:pPr>
       <w:r>
-        <w:t>El hallazgo metodológico central es que, para una economía exportadora de</w:t>
+        <w:t>¿El mismo tratamiento (filtro de commodities + hubs de reexportación)</w:t>
       </w:r>
     </w:p>
     <w:p>
@@ -3523,7 +3587,7 @@
         <w:pStyle w:val="Body"/>
       </w:pPr>
       <w:r>
-        <w:t>commodities como Perú, un modelo de gravedad "de manual" sobre el valor</w:t>
+        <w:t>produce el mismo efecto del lado importador? Se repitió exactamente el</w:t>
       </w:r>
     </w:p>
     <w:p>
@@ -3531,7 +3595,7 @@
         <w:pStyle w:val="Body"/>
       </w:pPr>
       <w:r>
-        <w:t>total exportado no mide lo que se cree que mide: una fracción sustancial del</w:t>
+        <w:t>procedimiento de la sección 4, con Perú como importador en vez de</w:t>
       </w:r>
     </w:p>
     <w:p>
@@ -3539,7 +3603,7 @@
         <w:pStyle w:val="Body"/>
       </w:pPr>
       <w:r>
-        <w:t>flujo refleja la geografía de la refinación y el tránsito global de</w:t>
+        <w:t>exportador: baci_flujos filtrado por importador = 604, mismo panel de</w:t>
       </w:r>
     </w:p>
     <w:p>
@@ -3547,15 +3611,438 @@
         <w:pStyle w:val="Body"/>
       </w:pPr>
       <w:r>
-        <w:t>materias primas (Suiza para oro, Namibia para concentrados de cobre, Países</w:t>
+        <w:t>224 socios, mismos controles.</w:t>
       </w:r>
     </w:p>
     <w:p>
       <w:pPr>
+        <w:spacing w:after="40"/>
+      </w:pPr>
+    </w:p>
+    <w:p>
+      <w:pPr>
+        <w:pStyle w:val="SubSecHdr"/>
+      </w:pPr>
+      <w:r>
+        <w:rPr>
+          <w:b/>
+          <w:color w:val="1A3050"/>
+          <w:sz w:val="21"/>
+        </w:rPr>
+        <w:t>5.1 Especificación cruda</w:t>
+      </w:r>
+    </w:p>
+    <w:p>
+      <w:pPr>
+        <w:spacing w:after="40"/>
+      </w:pPr>
+    </w:p>
+    <w:tbl>
+      <w:tblPr>
+        <w:tblW w:type="auto" w:w="0"/>
+        <w:jc w:val="center"/>
+        <w:tblLayout w:type="fixed"/>
+        <w:tblLook w:firstColumn="1" w:firstRow="1" w:lastColumn="0" w:lastRow="0" w:noHBand="0" w:noVBand="1" w:val="04A0"/>
+      </w:tblPr>
+      <w:tblGrid>
+        <w:gridCol w:w="2911"/>
+        <w:gridCol w:w="2911"/>
+        <w:gridCol w:w="2911"/>
+      </w:tblGrid>
+      <w:tr>
+        <w:tc>
+          <w:tcPr>
+            <w:tcW w:type="dxa" w:w="2910"/>
+            <w:shd w:val="clear" w:color="auto" w:fill="1A3050"/>
+          </w:tcPr>
+          <w:p>
+            <w:pPr>
+              <w:spacing w:before="60" w:after="60"/>
+            </w:pPr>
+            <w:r>
+              <w:rPr>
+                <w:b/>
+                <w:color w:val="FFFFFF"/>
+                <w:sz w:val="18"/>
+              </w:rPr>
+              <w:t>Variable</w:t>
+            </w:r>
+          </w:p>
+        </w:tc>
+        <w:tc>
+          <w:tcPr>
+            <w:tcW w:type="dxa" w:w="2910"/>
+            <w:shd w:val="clear" w:color="auto" w:fill="1A3050"/>
+          </w:tcPr>
+          <w:p>
+            <w:pPr>
+              <w:spacing w:before="60" w:after="60"/>
+            </w:pPr>
+            <w:r>
+              <w:rPr>
+                <w:b/>
+                <w:color w:val="FFFFFF"/>
+                <w:sz w:val="18"/>
+              </w:rPr>
+              <w:t>Coeficiente</w:t>
+            </w:r>
+          </w:p>
+        </w:tc>
+        <w:tc>
+          <w:tcPr>
+            <w:tcW w:type="dxa" w:w="2910"/>
+            <w:shd w:val="clear" w:color="auto" w:fill="1A3050"/>
+          </w:tcPr>
+          <w:p>
+            <w:pPr>
+              <w:spacing w:before="60" w:after="60"/>
+            </w:pPr>
+            <w:r>
+              <w:rPr>
+                <w:b/>
+                <w:color w:val="FFFFFF"/>
+                <w:sz w:val="18"/>
+              </w:rPr>
+              <w:t>p-valor</w:t>
+            </w:r>
+          </w:p>
+        </w:tc>
+      </w:tr>
+      <w:tr>
+        <w:tc>
+          <w:tcPr>
+            <w:tcW w:type="dxa" w:w="2910"/>
+            <w:shd w:val="clear" w:color="auto" w:fill="FFFFFF"/>
+          </w:tcPr>
+          <w:p>
+            <w:pPr>
+              <w:spacing w:before="60" w:after="60"/>
+            </w:pPr>
+            <w:r>
+              <w:rPr>
+                <w:sz w:val="18"/>
+              </w:rPr>
+              <w:t>log(PBI del socio)</w:t>
+            </w:r>
+          </w:p>
+        </w:tc>
+        <w:tc>
+          <w:tcPr>
+            <w:tcW w:type="dxa" w:w="2910"/>
+            <w:shd w:val="clear" w:color="auto" w:fill="FFFFFF"/>
+          </w:tcPr>
+          <w:p>
+            <w:pPr>
+              <w:spacing w:before="60" w:after="60"/>
+            </w:pPr>
+            <w:r>
+              <w:rPr>
+                <w:sz w:val="18"/>
+              </w:rPr>
+              <w:t>+1.18</w:t>
+            </w:r>
+          </w:p>
+        </w:tc>
+        <w:tc>
+          <w:tcPr>
+            <w:tcW w:type="dxa" w:w="2910"/>
+            <w:shd w:val="clear" w:color="auto" w:fill="FFFFFF"/>
+          </w:tcPr>
+          <w:p>
+            <w:pPr>
+              <w:spacing w:before="60" w:after="60"/>
+            </w:pPr>
+            <w:r>
+              <w:rPr>
+                <w:sz w:val="18"/>
+              </w:rPr>
+              <w:t>&lt;0.001</w:t>
+            </w:r>
+          </w:p>
+        </w:tc>
+      </w:tr>
+      <w:tr>
+        <w:tc>
+          <w:tcPr>
+            <w:tcW w:type="dxa" w:w="2910"/>
+            <w:shd w:val="clear" w:color="auto" w:fill="F4F6FA"/>
+          </w:tcPr>
+          <w:p>
+            <w:pPr>
+              <w:spacing w:before="60" w:after="60"/>
+            </w:pPr>
+            <w:r>
+              <w:rPr>
+                <w:sz w:val="18"/>
+              </w:rPr>
+              <w:t>log(distancia)</w:t>
+            </w:r>
+          </w:p>
+        </w:tc>
+        <w:tc>
+          <w:tcPr>
+            <w:tcW w:type="dxa" w:w="2910"/>
+            <w:shd w:val="clear" w:color="auto" w:fill="F4F6FA"/>
+          </w:tcPr>
+          <w:p>
+            <w:pPr>
+              <w:spacing w:before="60" w:after="60"/>
+            </w:pPr>
+            <w:r>
+              <w:rPr>
+                <w:sz w:val="18"/>
+              </w:rPr>
+              <w:t>+0.35</w:t>
+            </w:r>
+          </w:p>
+        </w:tc>
+        <w:tc>
+          <w:tcPr>
+            <w:tcW w:type="dxa" w:w="2910"/>
+            <w:shd w:val="clear" w:color="auto" w:fill="F4F6FA"/>
+          </w:tcPr>
+          <w:p>
+            <w:pPr>
+              <w:spacing w:before="60" w:after="60"/>
+            </w:pPr>
+            <w:r>
+              <w:rPr>
+                <w:sz w:val="18"/>
+              </w:rPr>
+              <w:t>0.209</w:t>
+            </w:r>
+          </w:p>
+        </w:tc>
+      </w:tr>
+      <w:tr>
+        <w:tc>
+          <w:tcPr>
+            <w:tcW w:type="dxa" w:w="2910"/>
+            <w:shd w:val="clear" w:color="auto" w:fill="FFFFFF"/>
+          </w:tcPr>
+          <w:p>
+            <w:pPr>
+              <w:spacing w:before="60" w:after="60"/>
+            </w:pPr>
+            <w:r>
+              <w:rPr>
+                <w:sz w:val="18"/>
+              </w:rPr>
+              <w:t>Frontera común</w:t>
+            </w:r>
+          </w:p>
+        </w:tc>
+        <w:tc>
+          <w:tcPr>
+            <w:tcW w:type="dxa" w:w="2910"/>
+            <w:shd w:val="clear" w:color="auto" w:fill="FFFFFF"/>
+          </w:tcPr>
+          <w:p>
+            <w:pPr>
+              <w:spacing w:before="60" w:after="60"/>
+            </w:pPr>
+            <w:r>
+              <w:rPr>
+                <w:sz w:val="18"/>
+              </w:rPr>
+              <w:t>+1.77</w:t>
+            </w:r>
+          </w:p>
+        </w:tc>
+        <w:tc>
+          <w:tcPr>
+            <w:tcW w:type="dxa" w:w="2910"/>
+            <w:shd w:val="clear" w:color="auto" w:fill="FFFFFF"/>
+          </w:tcPr>
+          <w:p>
+            <w:pPr>
+              <w:spacing w:before="60" w:after="60"/>
+            </w:pPr>
+            <w:r>
+              <w:rPr>
+                <w:sz w:val="18"/>
+              </w:rPr>
+              <w:t>&lt;0.001</w:t>
+            </w:r>
+          </w:p>
+        </w:tc>
+      </w:tr>
+      <w:tr>
+        <w:tc>
+          <w:tcPr>
+            <w:tcW w:type="dxa" w:w="2910"/>
+            <w:shd w:val="clear" w:color="auto" w:fill="F4F6FA"/>
+          </w:tcPr>
+          <w:p>
+            <w:pPr>
+              <w:spacing w:before="60" w:after="60"/>
+            </w:pPr>
+            <w:r>
+              <w:rPr>
+                <w:sz w:val="18"/>
+              </w:rPr>
+              <w:t>Idioma oficial común</w:t>
+            </w:r>
+          </w:p>
+        </w:tc>
+        <w:tc>
+          <w:tcPr>
+            <w:tcW w:type="dxa" w:w="2910"/>
+            <w:shd w:val="clear" w:color="auto" w:fill="F4F6FA"/>
+          </w:tcPr>
+          <w:p>
+            <w:pPr>
+              <w:spacing w:before="60" w:after="60"/>
+            </w:pPr>
+            <w:r>
+              <w:rPr>
+                <w:sz w:val="18"/>
+              </w:rPr>
+              <w:t>+2.09</w:t>
+            </w:r>
+          </w:p>
+        </w:tc>
+        <w:tc>
+          <w:tcPr>
+            <w:tcW w:type="dxa" w:w="2910"/>
+            <w:shd w:val="clear" w:color="auto" w:fill="F4F6FA"/>
+          </w:tcPr>
+          <w:p>
+            <w:pPr>
+              <w:spacing w:before="60" w:after="60"/>
+            </w:pPr>
+            <w:r>
+              <w:rPr>
+                <w:sz w:val="18"/>
+              </w:rPr>
+              <w:t>&lt;0.001</w:t>
+            </w:r>
+          </w:p>
+        </w:tc>
+      </w:tr>
+      <w:tr>
+        <w:tc>
+          <w:tcPr>
+            <w:tcW w:type="dxa" w:w="2910"/>
+            <w:shd w:val="clear" w:color="auto" w:fill="FFFFFF"/>
+          </w:tcPr>
+          <w:p>
+            <w:pPr>
+              <w:spacing w:before="60" w:after="60"/>
+            </w:pPr>
+            <w:r>
+              <w:rPr>
+                <w:sz w:val="18"/>
+              </w:rPr>
+              <w:t>Ex-colonia</w:t>
+            </w:r>
+          </w:p>
+        </w:tc>
+        <w:tc>
+          <w:tcPr>
+            <w:tcW w:type="dxa" w:w="2910"/>
+            <w:shd w:val="clear" w:color="auto" w:fill="FFFFFF"/>
+          </w:tcPr>
+          <w:p>
+            <w:pPr>
+              <w:spacing w:before="60" w:after="60"/>
+            </w:pPr>
+            <w:r>
+              <w:rPr>
+                <w:sz w:val="18"/>
+              </w:rPr>
+              <w:t>−1.38</w:t>
+            </w:r>
+          </w:p>
+        </w:tc>
+        <w:tc>
+          <w:tcPr>
+            <w:tcW w:type="dxa" w:w="2910"/>
+            <w:shd w:val="clear" w:color="auto" w:fill="FFFFFF"/>
+          </w:tcPr>
+          <w:p>
+            <w:pPr>
+              <w:spacing w:before="60" w:after="60"/>
+            </w:pPr>
+            <w:r>
+              <w:rPr>
+                <w:sz w:val="18"/>
+              </w:rPr>
+              <w:t>&lt;0.001</w:t>
+            </w:r>
+          </w:p>
+        </w:tc>
+      </w:tr>
+      <w:tr>
+        <w:tc>
+          <w:tcPr>
+            <w:tcW w:type="dxa" w:w="2910"/>
+            <w:shd w:val="clear" w:color="auto" w:fill="F4F6FA"/>
+          </w:tcPr>
+          <w:p>
+            <w:pPr>
+              <w:spacing w:before="60" w:after="60"/>
+            </w:pPr>
+            <w:r>
+              <w:rPr>
+                <w:sz w:val="18"/>
+              </w:rPr>
+              <w:t>Tiene acuerdo comercial</w:t>
+            </w:r>
+          </w:p>
+        </w:tc>
+        <w:tc>
+          <w:tcPr>
+            <w:tcW w:type="dxa" w:w="2910"/>
+            <w:shd w:val="clear" w:color="auto" w:fill="F4F6FA"/>
+          </w:tcPr>
+          <w:p>
+            <w:pPr>
+              <w:spacing w:before="60" w:after="60"/>
+            </w:pPr>
+            <w:r>
+              <w:rPr>
+                <w:sz w:val="18"/>
+              </w:rPr>
+              <w:t>+0.01</w:t>
+            </w:r>
+          </w:p>
+        </w:tc>
+        <w:tc>
+          <w:tcPr>
+            <w:tcW w:type="dxa" w:w="2910"/>
+            <w:shd w:val="clear" w:color="auto" w:fill="F4F6FA"/>
+          </w:tcPr>
+          <w:p>
+            <w:pPr>
+              <w:spacing w:before="60" w:after="60"/>
+            </w:pPr>
+            <w:r>
+              <w:rPr>
+                <w:sz w:val="18"/>
+              </w:rPr>
+              <w:t>0.967</w:t>
+            </w:r>
+          </w:p>
+        </w:tc>
+      </w:tr>
+    </w:tbl>
+    <w:p>
+      <w:pPr>
+        <w:spacing w:after="80"/>
+      </w:pPr>
+    </w:p>
+    <w:p>
+      <w:pPr>
+        <w:spacing w:after="40"/>
+      </w:pPr>
+    </w:p>
+    <w:p>
+      <w:pPr>
         <w:pStyle w:val="Body"/>
       </w:pPr>
       <w:r>
-        <w:t>Bajos/Panamá como puertos de redistribución), no la relación bilateral</w:t>
+        <w:t>n = 1,907; pseudo-R² = 0.93. A diferencia de las exportaciones, la</w:t>
       </w:r>
     </w:p>
     <w:p>
@@ -3563,7 +4050,7 @@
         <w:pStyle w:val="Body"/>
       </w:pPr>
       <w:r>
-        <w:t>económica entre Perú y el país de destino final. Ignorar esto no solo</w:t>
+        <w:t>distancia ya nace con el signo "equivocado" (positivo) aunque no</w:t>
       </w:r>
     </w:p>
     <w:p>
@@ -3571,7 +4058,7 @@
         <w:pStyle w:val="Body"/>
       </w:pPr>
       <w:r>
-        <w:t>distorsiona el coeficiente de distancia: también infla artificialmente el</w:t>
+        <w:t>significativo — una primera señal de que la historia del lado importador</w:t>
       </w:r>
     </w:p>
     <w:p>
@@ -3579,15 +4066,38 @@
         <w:pStyle w:val="Body"/>
       </w:pPr>
       <w:r>
-        <w:t>coeficiente de "tiene acuerdo comercial" (de +0.71 significativo a −0.05</w:t>
+        <w:t>podría ser distinta.</w:t>
       </w:r>
     </w:p>
     <w:p>
       <w:pPr>
+        <w:spacing w:after="40"/>
+      </w:pPr>
+    </w:p>
+    <w:p>
+      <w:pPr>
+        <w:pStyle w:val="SubSecHdr"/>
+      </w:pPr>
+      <w:r>
+        <w:rPr>
+          <w:b/>
+          <w:color w:val="1A3050"/>
+          <w:sz w:val="21"/>
+        </w:rPr>
+        <w:t>5.2 Diagnóstico: ¿commodities otra vez?</w:t>
+      </w:r>
+    </w:p>
+    <w:p>
+      <w:pPr>
+        <w:spacing w:after="40"/>
+      </w:pPr>
+    </w:p>
+    <w:p>
+      <w:pPr>
         <w:pStyle w:val="Body"/>
       </w:pPr>
       <w:r>
-        <w:t>estadísticamente nulo), porque los países con acuerdos comerciales vigentes</w:t>
+        <w:t>Antes de aplicar el mismo filtro de forma automática, se repitió el</w:t>
       </w:r>
     </w:p>
     <w:p>
@@ -3595,20 +4105,269 @@
         <w:pStyle w:val="Body"/>
       </w:pPr>
       <w:r>
-        <w:t>con Perú tienden a coincidir con los grandes compradores de oro y gas.</w:t>
+        <w:t>diagnóstico de residuos de Pearson sobre el total importado. El resultado</w:t>
       </w:r>
     </w:p>
     <w:p>
       <w:pPr>
+        <w:pStyle w:val="Body"/>
+      </w:pPr>
+      <w:r>
+        <w:t>confirma que sí hay un commodity dominante — pero no el mismo:</w:t>
+      </w:r>
+    </w:p>
+    <w:p>
+      <w:pPr>
         <w:spacing w:after="40"/>
       </w:pPr>
     </w:p>
+    <w:tbl>
+      <w:tblPr>
+        <w:tblW w:type="auto" w:w="0"/>
+        <w:jc w:val="center"/>
+        <w:tblLayout w:type="fixed"/>
+        <w:tblLook w:firstColumn="1" w:firstRow="1" w:lastColumn="0" w:lastRow="0" w:noHBand="0" w:noVBand="1" w:val="04A0"/>
+      </w:tblPr>
+      <w:tblGrid>
+        <w:gridCol w:w="2911"/>
+        <w:gridCol w:w="2911"/>
+        <w:gridCol w:w="2911"/>
+      </w:tblGrid>
+      <w:tr>
+        <w:tc>
+          <w:tcPr>
+            <w:tcW w:type="dxa" w:w="2910"/>
+            <w:shd w:val="clear" w:color="auto" w:fill="1A3050"/>
+          </w:tcPr>
+          <w:p>
+            <w:pPr>
+              <w:spacing w:before="60" w:after="60"/>
+            </w:pPr>
+            <w:r>
+              <w:rPr>
+                <w:b/>
+                <w:color w:val="FFFFFF"/>
+                <w:sz w:val="18"/>
+              </w:rPr>
+              <w:t>País</w:t>
+            </w:r>
+          </w:p>
+        </w:tc>
+        <w:tc>
+          <w:tcPr>
+            <w:tcW w:type="dxa" w:w="2910"/>
+            <w:shd w:val="clear" w:color="auto" w:fill="1A3050"/>
+          </w:tcPr>
+          <w:p>
+            <w:pPr>
+              <w:spacing w:before="60" w:after="60"/>
+            </w:pPr>
+            <w:r>
+              <w:rPr>
+                <w:b/>
+                <w:color w:val="FFFFFF"/>
+                <w:sz w:val="18"/>
+              </w:rPr>
+              <w:t>Producto (HS6)</w:t>
+            </w:r>
+          </w:p>
+        </w:tc>
+        <w:tc>
+          <w:tcPr>
+            <w:tcW w:type="dxa" w:w="2910"/>
+            <w:shd w:val="clear" w:color="auto" w:fill="1A3050"/>
+          </w:tcPr>
+          <w:p>
+            <w:pPr>
+              <w:spacing w:before="60" w:after="60"/>
+            </w:pPr>
+            <w:r>
+              <w:rPr>
+                <w:b/>
+                <w:color w:val="FFFFFF"/>
+                <w:sz w:val="18"/>
+              </w:rPr>
+              <w:t>Valor en la década</w:t>
+            </w:r>
+          </w:p>
+        </w:tc>
+      </w:tr>
+      <w:tr>
+        <w:tc>
+          <w:tcPr>
+            <w:tcW w:type="dxa" w:w="2910"/>
+            <w:shd w:val="clear" w:color="auto" w:fill="FFFFFF"/>
+          </w:tcPr>
+          <w:p>
+            <w:pPr>
+              <w:spacing w:before="60" w:after="60"/>
+            </w:pPr>
+            <w:r>
+              <w:rPr>
+                <w:sz w:val="18"/>
+              </w:rPr>
+              <w:t>Nigeria</w:t>
+            </w:r>
+          </w:p>
+        </w:tc>
+        <w:tc>
+          <w:tcPr>
+            <w:tcW w:type="dxa" w:w="2910"/>
+            <w:shd w:val="clear" w:color="auto" w:fill="FFFFFF"/>
+          </w:tcPr>
+          <w:p>
+            <w:pPr>
+              <w:spacing w:before="60" w:after="60"/>
+            </w:pPr>
+            <w:r>
+              <w:rPr>
+                <w:sz w:val="18"/>
+              </w:rPr>
+              <w:t>270900 — petróleo crudo</w:t>
+            </w:r>
+          </w:p>
+        </w:tc>
+        <w:tc>
+          <w:tcPr>
+            <w:tcW w:type="dxa" w:w="2910"/>
+            <w:shd w:val="clear" w:color="auto" w:fill="FFFFFF"/>
+          </w:tcPr>
+          <w:p>
+            <w:pPr>
+              <w:spacing w:before="60" w:after="60"/>
+            </w:pPr>
+            <w:r>
+              <w:rPr>
+                <w:sz w:val="18"/>
+              </w:rPr>
+              <w:t>USD 2,193 millones</w:t>
+            </w:r>
+          </w:p>
+        </w:tc>
+      </w:tr>
+      <w:tr>
+        <w:tc>
+          <w:tcPr>
+            <w:tcW w:type="dxa" w:w="2910"/>
+            <w:shd w:val="clear" w:color="auto" w:fill="F4F6FA"/>
+          </w:tcPr>
+          <w:p>
+            <w:pPr>
+              <w:spacing w:before="60" w:after="60"/>
+            </w:pPr>
+            <w:r>
+              <w:rPr>
+                <w:sz w:val="18"/>
+              </w:rPr>
+              <w:t>Trinidad y Tobago</w:t>
+            </w:r>
+          </w:p>
+        </w:tc>
+        <w:tc>
+          <w:tcPr>
+            <w:tcW w:type="dxa" w:w="2910"/>
+            <w:shd w:val="clear" w:color="auto" w:fill="F4F6FA"/>
+          </w:tcPr>
+          <w:p>
+            <w:pPr>
+              <w:spacing w:before="60" w:after="60"/>
+            </w:pPr>
+            <w:r>
+              <w:rPr>
+                <w:sz w:val="18"/>
+              </w:rPr>
+              <w:t>270900 — petróleo crudo</w:t>
+            </w:r>
+          </w:p>
+        </w:tc>
+        <w:tc>
+          <w:tcPr>
+            <w:tcW w:type="dxa" w:w="2910"/>
+            <w:shd w:val="clear" w:color="auto" w:fill="F4F6FA"/>
+          </w:tcPr>
+          <w:p>
+            <w:pPr>
+              <w:spacing w:before="60" w:after="60"/>
+            </w:pPr>
+            <w:r>
+              <w:rPr>
+                <w:sz w:val="18"/>
+              </w:rPr>
+              <w:t>USD 2,077 millones</w:t>
+            </w:r>
+          </w:p>
+        </w:tc>
+      </w:tr>
+      <w:tr>
+        <w:tc>
+          <w:tcPr>
+            <w:tcW w:type="dxa" w:w="2910"/>
+            <w:shd w:val="clear" w:color="auto" w:fill="FFFFFF"/>
+          </w:tcPr>
+          <w:p>
+            <w:pPr>
+              <w:spacing w:before="60" w:after="60"/>
+            </w:pPr>
+            <w:r>
+              <w:rPr>
+                <w:sz w:val="18"/>
+              </w:rPr>
+              <w:t>Congo</w:t>
+            </w:r>
+          </w:p>
+        </w:tc>
+        <w:tc>
+          <w:tcPr>
+            <w:tcW w:type="dxa" w:w="2910"/>
+            <w:shd w:val="clear" w:color="auto" w:fill="FFFFFF"/>
+          </w:tcPr>
+          <w:p>
+            <w:pPr>
+              <w:spacing w:before="60" w:after="60"/>
+            </w:pPr>
+            <w:r>
+              <w:rPr>
+                <w:sz w:val="18"/>
+              </w:rPr>
+              <w:t>270900 — petróleo crudo</w:t>
+            </w:r>
+          </w:p>
+        </w:tc>
+        <w:tc>
+          <w:tcPr>
+            <w:tcW w:type="dxa" w:w="2910"/>
+            <w:shd w:val="clear" w:color="auto" w:fill="FFFFFF"/>
+          </w:tcPr>
+          <w:p>
+            <w:pPr>
+              <w:spacing w:before="60" w:after="60"/>
+            </w:pPr>
+            <w:r>
+              <w:rPr>
+                <w:sz w:val="18"/>
+              </w:rPr>
+              <w:t>USD 228 millones</w:t>
+            </w:r>
+          </w:p>
+        </w:tc>
+      </w:tr>
+    </w:tbl>
+    <w:p>
+      <w:pPr>
+        <w:spacing w:after="80"/>
+      </w:pPr>
+    </w:p>
+    <w:p>
+      <w:pPr>
+        <w:spacing w:after="40"/>
+      </w:pPr>
+    </w:p>
     <w:p>
       <w:pPr>
         <w:pStyle w:val="Body"/>
       </w:pPr>
       <w:r>
-        <w:t>Este patrón no es exclusivo de Perú: es un problema conocido en la</w:t>
+        <w:t>HS27 (combustibles minerales) es, de hecho, el capítulo arancelario más</w:t>
       </w:r>
     </w:p>
     <w:p>
@@ -3616,7 +4375,7 @@
         <w:pStyle w:val="Body"/>
       </w:pPr>
       <w:r>
-        <w:t>literatura de gravedad para economías exportadoras de recursos naturales</w:t>
+        <w:t>grande de toda la canasta importadora peruana (USD 64,900 millones en la</w:t>
       </w:r>
     </w:p>
     <w:p>
@@ -3624,7 +4383,7 @@
         <w:pStyle w:val="Body"/>
       </w:pPr>
       <w:r>
-        <w:t>(Chile con cobre, los países del Golfo con petróleo, la República Democrática</w:t>
+        <w:t>década, más que maquinaria o vehículos) — Perú importa crudo para sus</w:t>
       </w:r>
     </w:p>
     <w:p>
@@ -3632,7 +4391,7 @@
         <w:pStyle w:val="Body"/>
       </w:pPr>
       <w:r>
-        <w:t>del Congo con cobalto). El aporte de este ejercicio es documentar el</w:t>
+        <w:t>refinerías pese a exportar su propio gas natural licuado. Por consistencia</w:t>
       </w:r>
     </w:p>
     <w:p>
@@ -3640,7 +4399,7 @@
         <w:pStyle w:val="Body"/>
       </w:pPr>
       <w:r>
-        <w:t>procedimiento completo y reproducible —diagnóstico de residuos, filtro por</w:t>
+        <w:t>metodológica se aplicó el mismo filtro HS26/HS71/HS27 usado en</w:t>
       </w:r>
     </w:p>
     <w:p>
@@ -3648,7 +4407,7 @@
         <w:pStyle w:val="Body"/>
       </w:pPr>
       <w:r>
-        <w:t>producto declarado a priori, filtro por país con lista estándar de la</w:t>
+        <w:t>exportaciones (HS26 y HS71 no son relevantes en volumen para las</w:t>
       </w:r>
     </w:p>
     <w:p>
@@ -3656,7 +4415,7 @@
         <w:pStyle w:val="Body"/>
       </w:pPr>
       <w:r>
-        <w:t>literatura, y el punto explícito en el que se decide dejar de excluir</w:t>
+        <w:t>importaciones, pero excluirlos no cambia nada y mantiene el filtro idéntico</w:t>
       </w:r>
     </w:p>
     <w:p>
@@ -3664,7 +4423,1151 @@
         <w:pStyle w:val="Body"/>
       </w:pPr>
       <w:r>
-        <w:t>observaciones— en un caso real con datos públicos verificables.</w:t>
+        <w:t>en ambas direcciones).</w:t>
+      </w:r>
+    </w:p>
+    <w:p>
+      <w:pPr>
+        <w:spacing w:after="40"/>
+      </w:pPr>
+    </w:p>
+    <w:p>
+      <w:pPr>
+        <w:pStyle w:val="SubSecHdr"/>
+      </w:pPr>
+      <w:r>
+        <w:rPr>
+          <w:b/>
+          <w:color w:val="1A3050"/>
+          <w:sz w:val="21"/>
+        </w:rPr>
+        <w:t>5.3 Resultado tras el filtro: la distancia empeora, no mejora</w:t>
+      </w:r>
+    </w:p>
+    <w:p>
+      <w:pPr>
+        <w:spacing w:after="40"/>
+      </w:pPr>
+    </w:p>
+    <w:tbl>
+      <w:tblPr>
+        <w:tblW w:type="auto" w:w="0"/>
+        <w:jc w:val="center"/>
+        <w:tblLayout w:type="fixed"/>
+        <w:tblLook w:firstColumn="1" w:firstRow="1" w:lastColumn="0" w:lastRow="0" w:noHBand="0" w:noVBand="1" w:val="04A0"/>
+      </w:tblPr>
+      <w:tblGrid>
+        <w:gridCol w:w="2183"/>
+        <w:gridCol w:w="2183"/>
+        <w:gridCol w:w="2183"/>
+        <w:gridCol w:w="2183"/>
+      </w:tblGrid>
+      <w:tr>
+        <w:tc>
+          <w:tcPr>
+            <w:tcW w:type="dxa" w:w="2183"/>
+            <w:shd w:val="clear" w:color="auto" w:fill="1A3050"/>
+          </w:tcPr>
+          <w:p>
+            <w:pPr>
+              <w:spacing w:before="60" w:after="60"/>
+            </w:pPr>
+            <w:r>
+              <w:rPr>
+                <w:b/>
+                <w:color w:val="FFFFFF"/>
+                <w:sz w:val="18"/>
+              </w:rPr>
+              <w:t>Variable</w:t>
+            </w:r>
+          </w:p>
+        </w:tc>
+        <w:tc>
+          <w:tcPr>
+            <w:tcW w:type="dxa" w:w="2183"/>
+            <w:shd w:val="clear" w:color="auto" w:fill="1A3050"/>
+          </w:tcPr>
+          <w:p>
+            <w:pPr>
+              <w:spacing w:before="60" w:after="60"/>
+            </w:pPr>
+            <w:r>
+              <w:rPr>
+                <w:b/>
+                <w:color w:val="FFFFFF"/>
+                <w:sz w:val="18"/>
+              </w:rPr>
+              <w:t>Cruda</w:t>
+            </w:r>
+          </w:p>
+        </w:tc>
+        <w:tc>
+          <w:tcPr>
+            <w:tcW w:type="dxa" w:w="2183"/>
+            <w:shd w:val="clear" w:color="auto" w:fill="1A3050"/>
+          </w:tcPr>
+          <w:p>
+            <w:pPr>
+              <w:spacing w:before="60" w:after="60"/>
+            </w:pPr>
+            <w:r>
+              <w:rPr>
+                <w:b/>
+                <w:color w:val="FFFFFF"/>
+                <w:sz w:val="18"/>
+              </w:rPr>
+              <w:t>Sin HS26/71/27</w:t>
+            </w:r>
+          </w:p>
+        </w:tc>
+        <w:tc>
+          <w:tcPr>
+            <w:tcW w:type="dxa" w:w="2183"/>
+            <w:shd w:val="clear" w:color="auto" w:fill="1A3050"/>
+          </w:tcPr>
+          <w:p>
+            <w:pPr>
+              <w:spacing w:before="60" w:after="60"/>
+            </w:pPr>
+            <w:r>
+              <w:rPr>
+                <w:b/>
+                <w:color w:val="FFFFFF"/>
+                <w:sz w:val="18"/>
+              </w:rPr>
+              <w:t>Final (sin hubs)</w:t>
+            </w:r>
+          </w:p>
+        </w:tc>
+      </w:tr>
+      <w:tr>
+        <w:tc>
+          <w:tcPr>
+            <w:tcW w:type="dxa" w:w="2183"/>
+            <w:shd w:val="clear" w:color="auto" w:fill="FFFFFF"/>
+          </w:tcPr>
+          <w:p>
+            <w:pPr>
+              <w:spacing w:before="60" w:after="60"/>
+            </w:pPr>
+            <w:r>
+              <w:rPr>
+                <w:sz w:val="18"/>
+              </w:rPr>
+              <w:t>log(PBI del socio)</w:t>
+            </w:r>
+          </w:p>
+        </w:tc>
+        <w:tc>
+          <w:tcPr>
+            <w:tcW w:type="dxa" w:w="2183"/>
+            <w:shd w:val="clear" w:color="auto" w:fill="FFFFFF"/>
+          </w:tcPr>
+          <w:p>
+            <w:pPr>
+              <w:spacing w:before="60" w:after="60"/>
+            </w:pPr>
+            <w:r>
+              <w:rPr>
+                <w:sz w:val="18"/>
+              </w:rPr>
+              <w:t>+1.18</w:t>
+            </w:r>
+          </w:p>
+        </w:tc>
+        <w:tc>
+          <w:tcPr>
+            <w:tcW w:type="dxa" w:w="2183"/>
+            <w:shd w:val="clear" w:color="auto" w:fill="FFFFFF"/>
+          </w:tcPr>
+          <w:p>
+            <w:pPr>
+              <w:spacing w:before="60" w:after="60"/>
+            </w:pPr>
+            <w:r>
+              <w:rPr>
+                <w:sz w:val="18"/>
+              </w:rPr>
+              <w:t>+1.19</w:t>
+            </w:r>
+          </w:p>
+        </w:tc>
+        <w:tc>
+          <w:tcPr>
+            <w:tcW w:type="dxa" w:w="2183"/>
+            <w:shd w:val="clear" w:color="auto" w:fill="FFFFFF"/>
+          </w:tcPr>
+          <w:p>
+            <w:pPr>
+              <w:spacing w:before="60" w:after="60"/>
+            </w:pPr>
+            <w:r>
+              <w:rPr>
+                <w:sz w:val="18"/>
+              </w:rPr>
+              <w:t>+1.19</w:t>
+            </w:r>
+          </w:p>
+        </w:tc>
+      </w:tr>
+      <w:tr>
+        <w:tc>
+          <w:tcPr>
+            <w:tcW w:type="dxa" w:w="2183"/>
+            <w:shd w:val="clear" w:color="auto" w:fill="F4F6FA"/>
+          </w:tcPr>
+          <w:p>
+            <w:pPr>
+              <w:spacing w:before="60" w:after="60"/>
+            </w:pPr>
+            <w:r>
+              <w:rPr>
+                <w:sz w:val="18"/>
+              </w:rPr>
+              <w:t>log(distancia)</w:t>
+            </w:r>
+          </w:p>
+        </w:tc>
+        <w:tc>
+          <w:tcPr>
+            <w:tcW w:type="dxa" w:w="2183"/>
+            <w:shd w:val="clear" w:color="auto" w:fill="F4F6FA"/>
+          </w:tcPr>
+          <w:p>
+            <w:pPr>
+              <w:spacing w:before="60" w:after="60"/>
+            </w:pPr>
+            <w:r>
+              <w:rPr>
+                <w:sz w:val="18"/>
+              </w:rPr>
+              <w:t>+0.35 (p=0.21)</w:t>
+            </w:r>
+          </w:p>
+        </w:tc>
+        <w:tc>
+          <w:tcPr>
+            <w:tcW w:type="dxa" w:w="2183"/>
+            <w:shd w:val="clear" w:color="auto" w:fill="F4F6FA"/>
+          </w:tcPr>
+          <w:p>
+            <w:pPr>
+              <w:spacing w:before="60" w:after="60"/>
+            </w:pPr>
+            <w:r>
+              <w:rPr>
+                <w:sz w:val="18"/>
+              </w:rPr>
+              <w:t>+0.88 (p=0.001)</w:t>
+            </w:r>
+          </w:p>
+        </w:tc>
+        <w:tc>
+          <w:tcPr>
+            <w:tcW w:type="dxa" w:w="2183"/>
+            <w:shd w:val="clear" w:color="auto" w:fill="F4F6FA"/>
+          </w:tcPr>
+          <w:p>
+            <w:pPr>
+              <w:spacing w:before="60" w:after="60"/>
+            </w:pPr>
+            <w:r>
+              <w:rPr>
+                <w:sz w:val="18"/>
+              </w:rPr>
+              <w:t>+0.90 (p&lt;0.001)</w:t>
+            </w:r>
+          </w:p>
+        </w:tc>
+      </w:tr>
+      <w:tr>
+        <w:tc>
+          <w:tcPr>
+            <w:tcW w:type="dxa" w:w="2183"/>
+            <w:shd w:val="clear" w:color="auto" w:fill="FFFFFF"/>
+          </w:tcPr>
+          <w:p>
+            <w:pPr>
+              <w:spacing w:before="60" w:after="60"/>
+            </w:pPr>
+            <w:r>
+              <w:rPr>
+                <w:sz w:val="18"/>
+              </w:rPr>
+              <w:t>Frontera común</w:t>
+            </w:r>
+          </w:p>
+        </w:tc>
+        <w:tc>
+          <w:tcPr>
+            <w:tcW w:type="dxa" w:w="2183"/>
+            <w:shd w:val="clear" w:color="auto" w:fill="FFFFFF"/>
+          </w:tcPr>
+          <w:p>
+            <w:pPr>
+              <w:spacing w:before="60" w:after="60"/>
+            </w:pPr>
+            <w:r>
+              <w:rPr>
+                <w:sz w:val="18"/>
+              </w:rPr>
+              <w:t>+1.77</w:t>
+            </w:r>
+          </w:p>
+        </w:tc>
+        <w:tc>
+          <w:tcPr>
+            <w:tcW w:type="dxa" w:w="2183"/>
+            <w:shd w:val="clear" w:color="auto" w:fill="FFFFFF"/>
+          </w:tcPr>
+          <w:p>
+            <w:pPr>
+              <w:spacing w:before="60" w:after="60"/>
+            </w:pPr>
+            <w:r>
+              <w:rPr>
+                <w:sz w:val="18"/>
+              </w:rPr>
+              <w:t>+2.16</w:t>
+            </w:r>
+          </w:p>
+        </w:tc>
+        <w:tc>
+          <w:tcPr>
+            <w:tcW w:type="dxa" w:w="2183"/>
+            <w:shd w:val="clear" w:color="auto" w:fill="FFFFFF"/>
+          </w:tcPr>
+          <w:p>
+            <w:pPr>
+              <w:spacing w:before="60" w:after="60"/>
+            </w:pPr>
+            <w:r>
+              <w:rPr>
+                <w:sz w:val="18"/>
+              </w:rPr>
+              <w:t>+2.19</w:t>
+            </w:r>
+          </w:p>
+        </w:tc>
+      </w:tr>
+      <w:tr>
+        <w:tc>
+          <w:tcPr>
+            <w:tcW w:type="dxa" w:w="2183"/>
+            <w:shd w:val="clear" w:color="auto" w:fill="F4F6FA"/>
+          </w:tcPr>
+          <w:p>
+            <w:pPr>
+              <w:spacing w:before="60" w:after="60"/>
+            </w:pPr>
+            <w:r>
+              <w:rPr>
+                <w:sz w:val="18"/>
+              </w:rPr>
+              <w:t>Idioma oficial común</w:t>
+            </w:r>
+          </w:p>
+        </w:tc>
+        <w:tc>
+          <w:tcPr>
+            <w:tcW w:type="dxa" w:w="2183"/>
+            <w:shd w:val="clear" w:color="auto" w:fill="F4F6FA"/>
+          </w:tcPr>
+          <w:p>
+            <w:pPr>
+              <w:spacing w:before="60" w:after="60"/>
+            </w:pPr>
+            <w:r>
+              <w:rPr>
+                <w:sz w:val="18"/>
+              </w:rPr>
+              <w:t>+2.09</w:t>
+            </w:r>
+          </w:p>
+        </w:tc>
+        <w:tc>
+          <w:tcPr>
+            <w:tcW w:type="dxa" w:w="2183"/>
+            <w:shd w:val="clear" w:color="auto" w:fill="F4F6FA"/>
+          </w:tcPr>
+          <w:p>
+            <w:pPr>
+              <w:spacing w:before="60" w:after="60"/>
+            </w:pPr>
+            <w:r>
+              <w:rPr>
+                <w:sz w:val="18"/>
+              </w:rPr>
+              <w:t>+2.64</w:t>
+            </w:r>
+          </w:p>
+        </w:tc>
+        <w:tc>
+          <w:tcPr>
+            <w:tcW w:type="dxa" w:w="2183"/>
+            <w:shd w:val="clear" w:color="auto" w:fill="F4F6FA"/>
+          </w:tcPr>
+          <w:p>
+            <w:pPr>
+              <w:spacing w:before="60" w:after="60"/>
+            </w:pPr>
+            <w:r>
+              <w:rPr>
+                <w:sz w:val="18"/>
+              </w:rPr>
+              <w:t>+2.64</w:t>
+            </w:r>
+          </w:p>
+        </w:tc>
+      </w:tr>
+      <w:tr>
+        <w:tc>
+          <w:tcPr>
+            <w:tcW w:type="dxa" w:w="2183"/>
+            <w:shd w:val="clear" w:color="auto" w:fill="FFFFFF"/>
+          </w:tcPr>
+          <w:p>
+            <w:pPr>
+              <w:spacing w:before="60" w:after="60"/>
+            </w:pPr>
+            <w:r>
+              <w:rPr>
+                <w:sz w:val="18"/>
+              </w:rPr>
+              <w:t>Ex-colonia</w:t>
+            </w:r>
+          </w:p>
+        </w:tc>
+        <w:tc>
+          <w:tcPr>
+            <w:tcW w:type="dxa" w:w="2183"/>
+            <w:shd w:val="clear" w:color="auto" w:fill="FFFFFF"/>
+          </w:tcPr>
+          <w:p>
+            <w:pPr>
+              <w:spacing w:before="60" w:after="60"/>
+            </w:pPr>
+            <w:r>
+              <w:rPr>
+                <w:sz w:val="18"/>
+              </w:rPr>
+              <w:t>−1.38</w:t>
+            </w:r>
+          </w:p>
+        </w:tc>
+        <w:tc>
+          <w:tcPr>
+            <w:tcW w:type="dxa" w:w="2183"/>
+            <w:shd w:val="clear" w:color="auto" w:fill="FFFFFF"/>
+          </w:tcPr>
+          <w:p>
+            <w:pPr>
+              <w:spacing w:before="60" w:after="60"/>
+            </w:pPr>
+            <w:r>
+              <w:rPr>
+                <w:sz w:val="18"/>
+              </w:rPr>
+              <w:t>−1.70</w:t>
+            </w:r>
+          </w:p>
+        </w:tc>
+        <w:tc>
+          <w:tcPr>
+            <w:tcW w:type="dxa" w:w="2183"/>
+            <w:shd w:val="clear" w:color="auto" w:fill="FFFFFF"/>
+          </w:tcPr>
+          <w:p>
+            <w:pPr>
+              <w:spacing w:before="60" w:after="60"/>
+            </w:pPr>
+            <w:r>
+              <w:rPr>
+                <w:sz w:val="18"/>
+              </w:rPr>
+              <w:t>−1.71</w:t>
+            </w:r>
+          </w:p>
+        </w:tc>
+      </w:tr>
+      <w:tr>
+        <w:tc>
+          <w:tcPr>
+            <w:tcW w:type="dxa" w:w="2183"/>
+            <w:shd w:val="clear" w:color="auto" w:fill="F4F6FA"/>
+          </w:tcPr>
+          <w:p>
+            <w:pPr>
+              <w:spacing w:before="60" w:after="60"/>
+            </w:pPr>
+            <w:r>
+              <w:rPr>
+                <w:sz w:val="18"/>
+              </w:rPr>
+              <w:t>Tiene acuerdo comercial</w:t>
+            </w:r>
+          </w:p>
+        </w:tc>
+        <w:tc>
+          <w:tcPr>
+            <w:tcW w:type="dxa" w:w="2183"/>
+            <w:shd w:val="clear" w:color="auto" w:fill="F4F6FA"/>
+          </w:tcPr>
+          <w:p>
+            <w:pPr>
+              <w:spacing w:before="60" w:after="60"/>
+            </w:pPr>
+            <w:r>
+              <w:rPr>
+                <w:sz w:val="18"/>
+              </w:rPr>
+              <w:t>+0.01</w:t>
+            </w:r>
+          </w:p>
+        </w:tc>
+        <w:tc>
+          <w:tcPr>
+            <w:tcW w:type="dxa" w:w="2183"/>
+            <w:shd w:val="clear" w:color="auto" w:fill="F4F6FA"/>
+          </w:tcPr>
+          <w:p>
+            <w:pPr>
+              <w:spacing w:before="60" w:after="60"/>
+            </w:pPr>
+            <w:r>
+              <w:rPr>
+                <w:sz w:val="18"/>
+              </w:rPr>
+              <w:t>−0.06</w:t>
+            </w:r>
+          </w:p>
+        </w:tc>
+        <w:tc>
+          <w:tcPr>
+            <w:tcW w:type="dxa" w:w="2183"/>
+            <w:shd w:val="clear" w:color="auto" w:fill="F4F6FA"/>
+          </w:tcPr>
+          <w:p>
+            <w:pPr>
+              <w:spacing w:before="60" w:after="60"/>
+            </w:pPr>
+            <w:r>
+              <w:rPr>
+                <w:sz w:val="18"/>
+              </w:rPr>
+              <w:t>−0.06</w:t>
+            </w:r>
+          </w:p>
+        </w:tc>
+      </w:tr>
+    </w:tbl>
+    <w:p>
+      <w:pPr>
+        <w:spacing w:after="80"/>
+      </w:pPr>
+    </w:p>
+    <w:p>
+      <w:pPr>
+        <w:spacing w:after="40"/>
+      </w:pPr>
+    </w:p>
+    <w:p>
+      <w:pPr>
+        <w:pStyle w:val="Body"/>
+      </w:pPr>
+      <w:r>
+        <w:t>n final = 1,847; pseudo-R² = 0.92. A diferencia de las exportaciones, quitar</w:t>
+      </w:r>
+    </w:p>
+    <w:p>
+      <w:pPr>
+        <w:pStyle w:val="Body"/>
+      </w:pPr>
+      <w:r>
+        <w:t>los commodities no corrige el signo de la distancia — lo empeora y lo</w:t>
+      </w:r>
+    </w:p>
+    <w:p>
+      <w:pPr>
+        <w:pStyle w:val="Body"/>
+      </w:pPr>
+      <w:r>
+        <w:t>vuelve fuertemente significativo en la dirección "incorrecta".</w:t>
+      </w:r>
+    </w:p>
+    <w:p>
+      <w:pPr>
+        <w:spacing w:after="40"/>
+      </w:pPr>
+    </w:p>
+    <w:p>
+      <w:pPr>
+        <w:pStyle w:val="SubSecHdr"/>
+      </w:pPr>
+      <w:r>
+        <w:rPr>
+          <w:b/>
+          <w:color w:val="1A3050"/>
+          <w:sz w:val="21"/>
+        </w:rPr>
+        <w:t>5.4 Por qué esto no es el mismo artefacto: verificación</w:t>
+      </w:r>
+    </w:p>
+    <w:p>
+      <w:pPr>
+        <w:spacing w:after="40"/>
+      </w:pPr>
+    </w:p>
+    <w:p>
+      <w:pPr>
+        <w:pStyle w:val="Body"/>
+      </w:pPr>
+      <w:r>
+        <w:t>Antes de aceptar este resultado como genuino (y no como otro artefacto sin</w:t>
+      </w:r>
+    </w:p>
+    <w:p>
+      <w:pPr>
+        <w:pStyle w:val="Body"/>
+      </w:pPr>
+      <w:r>
+        <w:t>detectar), se repitió la misma verificación que en la sección 4: ¿quién</w:t>
+      </w:r>
+    </w:p>
+    <w:p>
+      <w:pPr>
+        <w:pStyle w:val="Body"/>
+      </w:pPr>
+      <w:r>
+        <w:t>domina los residuos de Pearson de la especificación final, y qué compra</w:t>
+      </w:r>
+    </w:p>
+    <w:p>
+      <w:pPr>
+        <w:pStyle w:val="Body"/>
+      </w:pPr>
+      <w:r>
+        <w:t>Perú de los mayores socios importadores?</w:t>
+      </w:r>
+    </w:p>
+    <w:p>
+      <w:pPr>
+        <w:spacing w:after="40"/>
+      </w:pPr>
+    </w:p>
+    <w:p>
+      <w:pPr>
+        <w:pStyle w:val="Bullet"/>
+        <w:ind w:left="400" w:hanging="280"/>
+      </w:pPr>
+      <w:r>
+        <w:t>•  Los mayores residuos son Argentina (hasta USD 2,779 millones/año) y</w:t>
+      </w:r>
+    </w:p>
+    <w:p>
+      <w:pPr>
+        <w:pStyle w:val="Body"/>
+      </w:pPr>
+      <w:r>
+        <w:t>Bolivia — vecinos con una relación comercial real y grande (trigo,</w:t>
+      </w:r>
+    </w:p>
+    <w:p>
+      <w:pPr>
+        <w:pStyle w:val="Body"/>
+      </w:pPr>
+      <w:r>
+        <w:t>soya, gas por ducto, insumos agropecuarios), no hubs de tránsito.</w:t>
+      </w:r>
+    </w:p>
+    <w:p>
+      <w:pPr>
+        <w:pStyle w:val="Bullet"/>
+        <w:ind w:left="400" w:hanging="280"/>
+      </w:pPr>
+      <w:r>
+        <w:t>•  Los mayores orígenes de importación en valor absoluto son China (USD</w:t>
+      </w:r>
+    </w:p>
+    <w:p>
+      <w:pPr>
+        <w:pStyle w:val="Body"/>
+      </w:pPr>
+      <w:r>
+        <w:t>119,739 millones en la década — más del doble que EE.UU.), Alemania,</w:t>
+      </w:r>
+    </w:p>
+    <w:p>
+      <w:pPr>
+        <w:pStyle w:val="Body"/>
+      </w:pPr>
+      <w:r>
+        <w:t>Japón e India: las grandes potencias manufactureras globales, todas muy</w:t>
+      </w:r>
+    </w:p>
+    <w:p>
+      <w:pPr>
+        <w:pStyle w:val="Body"/>
+      </w:pPr>
+      <w:r>
+        <w:t>lejanas de Perú.</w:t>
+      </w:r>
+    </w:p>
+    <w:p>
+      <w:pPr>
+        <w:spacing w:after="40"/>
+      </w:pPr>
+    </w:p>
+    <w:p>
+      <w:pPr>
+        <w:pStyle w:val="Body"/>
+      </w:pPr>
+      <w:r>
+        <w:t>No hay ningún país de tránsito conocido (Róterdam, Singapur, etc.)</w:t>
+      </w:r>
+    </w:p>
+    <w:p>
+      <w:pPr>
+        <w:pStyle w:val="Body"/>
+      </w:pPr>
+      <w:r>
+        <w:t>dominando los residuos del lado importador, como sí ocurría en</w:t>
+      </w:r>
+    </w:p>
+    <w:p>
+      <w:pPr>
+        <w:pStyle w:val="Body"/>
+      </w:pPr>
+      <w:r>
+        <w:t>exportaciones. La lectura más simple y consistente con la evidencia es que</w:t>
+      </w:r>
+    </w:p>
+    <w:p>
+      <w:pPr>
+        <w:pStyle w:val="Body"/>
+      </w:pPr>
+      <w:r>
+        <w:t>el signo positivo de la distancia en importaciones **no es un artefacto de</w:t>
+      </w:r>
+    </w:p>
+    <w:p>
+      <w:pPr>
+        <w:pStyle w:val="Body"/>
+      </w:pPr>
+      <w:r>
+        <w:t>medición que corregir**: refleja que la canasta importadora peruana</w:t>
+      </w:r>
+    </w:p>
+    <w:p>
+      <w:pPr>
+        <w:pStyle w:val="Body"/>
+      </w:pPr>
+      <w:r>
+        <w:t>—maquinaria, electrónica, vehículos, insumos industriales— está</w:t>
+      </w:r>
+    </w:p>
+    <w:p>
+      <w:pPr>
+        <w:pStyle w:val="Body"/>
+      </w:pPr>
+      <w:r>
+        <w:t>estructuralmente concentrada en un puñado de potencias manufactureras</w:t>
+      </w:r>
+    </w:p>
+    <w:p>
+      <w:pPr>
+        <w:pStyle w:val="Body"/>
+      </w:pPr>
+      <w:r>
+        <w:t>lejanas (sobre todo China), un patrón documentado en la literatura reciente</w:t>
+      </w:r>
+    </w:p>
+    <w:p>
+      <w:pPr>
+        <w:pStyle w:val="Body"/>
+      </w:pPr>
+      <w:r>
+        <w:t>de comercio de América Latina con Asia, y que domina sobre cualquier</w:t>
+      </w:r>
+    </w:p>
+    <w:p>
+      <w:pPr>
+        <w:pStyle w:val="Body"/>
+      </w:pPr>
+      <w:r>
+        <w:t>preferencia por proximidad geográfica.</w:t>
+      </w:r>
+    </w:p>
+    <w:p>
+      <w:pPr>
+        <w:spacing w:after="40"/>
+      </w:pPr>
+    </w:p>
+    <w:p>
+      <w:pPr>
+        <w:pStyle w:val="SubSecHdr"/>
+      </w:pPr>
+      <w:r>
+        <w:rPr>
+          <w:b/>
+          <w:color w:val="1A3050"/>
+          <w:sz w:val="21"/>
+        </w:rPr>
+        <w:t>5.5 La asimetría exportación-importación</w:t>
+      </w:r>
+    </w:p>
+    <w:p>
+      <w:pPr>
+        <w:spacing w:after="40"/>
+      </w:pPr>
+    </w:p>
+    <w:tbl>
+      <w:tblPr>
+        <w:tblW w:type="auto" w:w="0"/>
+        <w:jc w:val="center"/>
+        <w:tblLayout w:type="fixed"/>
+        <w:tblLook w:firstColumn="1" w:firstRow="1" w:lastColumn="0" w:lastRow="0" w:noHBand="0" w:noVBand="1" w:val="04A0"/>
+      </w:tblPr>
+      <w:tblGrid>
+        <w:gridCol w:w="2911"/>
+        <w:gridCol w:w="2911"/>
+        <w:gridCol w:w="2911"/>
+      </w:tblGrid>
+      <w:tr>
+        <w:tc>
+          <w:tcPr>
+            <w:tcW w:type="dxa" w:w="2910"/>
+            <w:shd w:val="clear" w:color="auto" w:fill="1A3050"/>
+          </w:tcPr>
+          <w:p>
+            <w:pPr>
+              <w:spacing w:before="60" w:after="60"/>
+            </w:pPr>
+            <w:r>
+              <w:rPr>
+                <w:b/>
+                <w:color w:val="FFFFFF"/>
+                <w:sz w:val="18"/>
+              </w:rPr>
+            </w:r>
+          </w:p>
+        </w:tc>
+        <w:tc>
+          <w:tcPr>
+            <w:tcW w:type="dxa" w:w="2910"/>
+            <w:shd w:val="clear" w:color="auto" w:fill="1A3050"/>
+          </w:tcPr>
+          <w:p>
+            <w:pPr>
+              <w:spacing w:before="60" w:after="60"/>
+            </w:pPr>
+            <w:r>
+              <w:rPr>
+                <w:b/>
+                <w:color w:val="FFFFFF"/>
+                <w:sz w:val="18"/>
+              </w:rPr>
+              <w:t>Exportaciones (sec. 4.5)</w:t>
+            </w:r>
+          </w:p>
+        </w:tc>
+        <w:tc>
+          <w:tcPr>
+            <w:tcW w:type="dxa" w:w="2910"/>
+            <w:shd w:val="clear" w:color="auto" w:fill="1A3050"/>
+          </w:tcPr>
+          <w:p>
+            <w:pPr>
+              <w:spacing w:before="60" w:after="60"/>
+            </w:pPr>
+            <w:r>
+              <w:rPr>
+                <w:b/>
+                <w:color w:val="FFFFFF"/>
+                <w:sz w:val="18"/>
+              </w:rPr>
+              <w:t>Importaciones (sec. 5.3)</w:t>
+            </w:r>
+          </w:p>
+        </w:tc>
+      </w:tr>
+      <w:tr>
+        <w:tc>
+          <w:tcPr>
+            <w:tcW w:type="dxa" w:w="2910"/>
+            <w:shd w:val="clear" w:color="auto" w:fill="FFFFFF"/>
+          </w:tcPr>
+          <w:p>
+            <w:pPr>
+              <w:spacing w:before="60" w:after="60"/>
+            </w:pPr>
+            <w:r>
+              <w:rPr>
+                <w:sz w:val="18"/>
+              </w:rPr>
+              <w:t>log(distancia)</w:t>
+            </w:r>
+          </w:p>
+        </w:tc>
+        <w:tc>
+          <w:tcPr>
+            <w:tcW w:type="dxa" w:w="2910"/>
+            <w:shd w:val="clear" w:color="auto" w:fill="FFFFFF"/>
+          </w:tcPr>
+          <w:p>
+            <w:pPr>
+              <w:spacing w:before="60" w:after="60"/>
+            </w:pPr>
+            <w:r>
+              <w:rPr>
+                <w:sz w:val="18"/>
+              </w:rPr>
+              <w:t>−0.58 (p=0.071)</w:t>
+            </w:r>
+          </w:p>
+        </w:tc>
+        <w:tc>
+          <w:tcPr>
+            <w:tcW w:type="dxa" w:w="2910"/>
+            <w:shd w:val="clear" w:color="auto" w:fill="FFFFFF"/>
+          </w:tcPr>
+          <w:p>
+            <w:pPr>
+              <w:spacing w:before="60" w:after="60"/>
+            </w:pPr>
+            <w:r>
+              <w:rPr>
+                <w:sz w:val="18"/>
+              </w:rPr>
+              <w:t>+0.90 (p&lt;0.001)</w:t>
+            </w:r>
+          </w:p>
+        </w:tc>
+      </w:tr>
+      <w:tr>
+        <w:tc>
+          <w:tcPr>
+            <w:tcW w:type="dxa" w:w="2910"/>
+            <w:shd w:val="clear" w:color="auto" w:fill="F4F6FA"/>
+          </w:tcPr>
+          <w:p>
+            <w:pPr>
+              <w:spacing w:before="60" w:after="60"/>
+            </w:pPr>
+            <w:r>
+              <w:rPr>
+                <w:sz w:val="18"/>
+              </w:rPr>
+              <w:t>Frontera común</w:t>
+            </w:r>
+          </w:p>
+        </w:tc>
+        <w:tc>
+          <w:tcPr>
+            <w:tcW w:type="dxa" w:w="2910"/>
+            <w:shd w:val="clear" w:color="auto" w:fill="F4F6FA"/>
+          </w:tcPr>
+          <w:p>
+            <w:pPr>
+              <w:spacing w:before="60" w:after="60"/>
+            </w:pPr>
+            <w:r>
+              <w:rPr>
+                <w:sz w:val="18"/>
+              </w:rPr>
+              <w:t>+1.02</w:t>
+            </w:r>
+          </w:p>
+        </w:tc>
+        <w:tc>
+          <w:tcPr>
+            <w:tcW w:type="dxa" w:w="2910"/>
+            <w:shd w:val="clear" w:color="auto" w:fill="F4F6FA"/>
+          </w:tcPr>
+          <w:p>
+            <w:pPr>
+              <w:spacing w:before="60" w:after="60"/>
+            </w:pPr>
+            <w:r>
+              <w:rPr>
+                <w:sz w:val="18"/>
+              </w:rPr>
+              <w:t>+2.19</w:t>
+            </w:r>
+          </w:p>
+        </w:tc>
+      </w:tr>
+      <w:tr>
+        <w:tc>
+          <w:tcPr>
+            <w:tcW w:type="dxa" w:w="2910"/>
+            <w:shd w:val="clear" w:color="auto" w:fill="FFFFFF"/>
+          </w:tcPr>
+          <w:p>
+            <w:pPr>
+              <w:spacing w:before="60" w:after="60"/>
+            </w:pPr>
+            <w:r>
+              <w:rPr>
+                <w:sz w:val="18"/>
+              </w:rPr>
+              <w:t>Idioma oficial común</w:t>
+            </w:r>
+          </w:p>
+        </w:tc>
+        <w:tc>
+          <w:tcPr>
+            <w:tcW w:type="dxa" w:w="2910"/>
+            <w:shd w:val="clear" w:color="auto" w:fill="FFFFFF"/>
+          </w:tcPr>
+          <w:p>
+            <w:pPr>
+              <w:spacing w:before="60" w:after="60"/>
+            </w:pPr>
+            <w:r>
+              <w:rPr>
+                <w:sz w:val="18"/>
+              </w:rPr>
+              <w:t>+1.12</w:t>
+            </w:r>
+          </w:p>
+        </w:tc>
+        <w:tc>
+          <w:tcPr>
+            <w:tcW w:type="dxa" w:w="2910"/>
+            <w:shd w:val="clear" w:color="auto" w:fill="FFFFFF"/>
+          </w:tcPr>
+          <w:p>
+            <w:pPr>
+              <w:spacing w:before="60" w:after="60"/>
+            </w:pPr>
+            <w:r>
+              <w:rPr>
+                <w:sz w:val="18"/>
+              </w:rPr>
+              <w:t>+2.64</w:t>
+            </w:r>
+          </w:p>
+        </w:tc>
+      </w:tr>
+      <w:tr>
+        <w:tc>
+          <w:tcPr>
+            <w:tcW w:type="dxa" w:w="2910"/>
+            <w:shd w:val="clear" w:color="auto" w:fill="F4F6FA"/>
+          </w:tcPr>
+          <w:p>
+            <w:pPr>
+              <w:spacing w:before="60" w:after="60"/>
+            </w:pPr>
+            <w:r>
+              <w:rPr>
+                <w:sz w:val="18"/>
+              </w:rPr>
+              <w:t>Ex-colonia</w:t>
+            </w:r>
+          </w:p>
+        </w:tc>
+        <w:tc>
+          <w:tcPr>
+            <w:tcW w:type="dxa" w:w="2910"/>
+            <w:shd w:val="clear" w:color="auto" w:fill="F4F6FA"/>
+          </w:tcPr>
+          <w:p>
+            <w:pPr>
+              <w:spacing w:before="60" w:after="60"/>
+            </w:pPr>
+            <w:r>
+              <w:rPr>
+                <w:sz w:val="18"/>
+              </w:rPr>
+              <w:t>+0.23 (ns)</w:t>
+            </w:r>
+          </w:p>
+        </w:tc>
+        <w:tc>
+          <w:tcPr>
+            <w:tcW w:type="dxa" w:w="2910"/>
+            <w:shd w:val="clear" w:color="auto" w:fill="F4F6FA"/>
+          </w:tcPr>
+          <w:p>
+            <w:pPr>
+              <w:spacing w:before="60" w:after="60"/>
+            </w:pPr>
+            <w:r>
+              <w:rPr>
+                <w:sz w:val="18"/>
+              </w:rPr>
+              <w:t>−1.71 (p&lt;0.001)</w:t>
+            </w:r>
+          </w:p>
+        </w:tc>
+      </w:tr>
+    </w:tbl>
+    <w:p>
+      <w:pPr>
+        <w:spacing w:after="80"/>
+      </w:pPr>
+    </w:p>
+    <w:p>
+      <w:pPr>
+        <w:spacing w:after="40"/>
+      </w:pPr>
+    </w:p>
+    <w:p>
+      <w:pPr>
+        <w:pStyle w:val="Body"/>
+      </w:pPr>
+      <w:r>
+        <w:t>Perú exporta siguiendo el patrón de gravedad clásico una vez limpia la</w:t>
+      </w:r>
+    </w:p>
+    <w:p>
+      <w:pPr>
+        <w:pStyle w:val="Body"/>
+      </w:pPr>
+      <w:r>
+        <w:t>distorsión de commodities (más a lo cercano), pero importa en contra del</w:t>
+      </w:r>
+    </w:p>
+    <w:p>
+      <w:pPr>
+        <w:pStyle w:val="Body"/>
+      </w:pPr>
+      <w:r>
+        <w:t>patrón de gravedad (más de lo lejano) — un reflejo fiel de ser, a la vez,</w:t>
+      </w:r>
+    </w:p>
+    <w:p>
+      <w:pPr>
+        <w:pStyle w:val="Body"/>
+      </w:pPr>
+      <w:r>
+        <w:t>un exportador de materias primas regionales y un importador de manufactura</w:t>
+      </w:r>
+    </w:p>
+    <w:p>
+      <w:pPr>
+        <w:pStyle w:val="Body"/>
+      </w:pPr>
+      <w:r>
+        <w:t>global concentrada en Asia. Ninguna de las dos direcciones es "la correcta";</w:t>
+      </w:r>
+    </w:p>
+    <w:p>
+      <w:pPr>
+        <w:pStyle w:val="Body"/>
+      </w:pPr>
+      <w:r>
+        <w:t>son dos estructuras económicas distintas que un solo coeficiente de</w:t>
+      </w:r>
+    </w:p>
+    <w:p>
+      <w:pPr>
+        <w:pStyle w:val="Body"/>
+      </w:pPr>
+      <w:r>
+        <w:t>distancia, mal especificado, podría haber ocultado.</w:t>
       </w:r>
     </w:p>
     <w:p>
@@ -3684,7 +5587,7 @@
           <w:color w:val="FFFFFF"/>
           <w:sz w:val="22"/>
         </w:rPr>
-        <w:t>6. Limitaciones</w:t>
+        <w:t>6. Discusión</w:t>
       </w:r>
     </w:p>
     <w:p>
@@ -3702,6 +5605,273 @@
     </w:p>
     <w:p>
       <w:pPr>
+        <w:pStyle w:val="Body"/>
+      </w:pPr>
+      <w:r>
+        <w:t>El hallazgo metodológico central es que, para una economía exportadora de</w:t>
+      </w:r>
+    </w:p>
+    <w:p>
+      <w:pPr>
+        <w:pStyle w:val="Body"/>
+      </w:pPr>
+      <w:r>
+        <w:t>commodities como Perú, un modelo de gravedad "de manual" sobre el valor</w:t>
+      </w:r>
+    </w:p>
+    <w:p>
+      <w:pPr>
+        <w:pStyle w:val="Body"/>
+      </w:pPr>
+      <w:r>
+        <w:t>total exportado no mide lo que se cree que mide: una fracción sustancial del</w:t>
+      </w:r>
+    </w:p>
+    <w:p>
+      <w:pPr>
+        <w:pStyle w:val="Body"/>
+      </w:pPr>
+      <w:r>
+        <w:t>flujo refleja la geografía de la refinación y el tránsito global de</w:t>
+      </w:r>
+    </w:p>
+    <w:p>
+      <w:pPr>
+        <w:pStyle w:val="Body"/>
+      </w:pPr>
+      <w:r>
+        <w:t>materias primas (Suiza para oro, Namibia para concentrados de cobre, Países</w:t>
+      </w:r>
+    </w:p>
+    <w:p>
+      <w:pPr>
+        <w:pStyle w:val="Body"/>
+      </w:pPr>
+      <w:r>
+        <w:t>Bajos/Panamá como puertos de redistribución), no la relación bilateral</w:t>
+      </w:r>
+    </w:p>
+    <w:p>
+      <w:pPr>
+        <w:pStyle w:val="Body"/>
+      </w:pPr>
+      <w:r>
+        <w:t>económica entre Perú y el país de destino final. Ignorar esto no solo</w:t>
+      </w:r>
+    </w:p>
+    <w:p>
+      <w:pPr>
+        <w:pStyle w:val="Body"/>
+      </w:pPr>
+      <w:r>
+        <w:t>distorsiona el coeficiente de distancia: también infla artificialmente el</w:t>
+      </w:r>
+    </w:p>
+    <w:p>
+      <w:pPr>
+        <w:pStyle w:val="Body"/>
+      </w:pPr>
+      <w:r>
+        <w:t>coeficiente de "tiene acuerdo comercial" (de +0.71 significativo a −0.05</w:t>
+      </w:r>
+    </w:p>
+    <w:p>
+      <w:pPr>
+        <w:pStyle w:val="Body"/>
+      </w:pPr>
+      <w:r>
+        <w:t>estadísticamente nulo), porque los países con acuerdos comerciales vigentes</w:t>
+      </w:r>
+    </w:p>
+    <w:p>
+      <w:pPr>
+        <w:pStyle w:val="Body"/>
+      </w:pPr>
+      <w:r>
+        <w:t>con Perú tienden a coincidir con los grandes compradores de oro y gas.</w:t>
+      </w:r>
+    </w:p>
+    <w:p>
+      <w:pPr>
+        <w:spacing w:after="40"/>
+      </w:pPr>
+    </w:p>
+    <w:p>
+      <w:pPr>
+        <w:pStyle w:val="Body"/>
+      </w:pPr>
+      <w:r>
+        <w:t>La sección 5 muestra, además, que el mismo diagnóstico aplicado con el mismo</w:t>
+      </w:r>
+    </w:p>
+    <w:p>
+      <w:pPr>
+        <w:pStyle w:val="Body"/>
+      </w:pPr>
+      <w:r>
+        <w:t>rigor a las importaciones no produce el mismo resultado — y eso es, en sí</w:t>
+      </w:r>
+    </w:p>
+    <w:p>
+      <w:pPr>
+        <w:pStyle w:val="Body"/>
+      </w:pPr>
+      <w:r>
+        <w:t>mismo, la evidencia de que el procedimiento no está sesgado hacia "encontrar"</w:t>
+      </w:r>
+    </w:p>
+    <w:p>
+      <w:pPr>
+        <w:pStyle w:val="Body"/>
+      </w:pPr>
+      <w:r>
+        <w:t>el signo esperado: si lo estuviera, se habría seguido ajustando el filtro de</w:t>
+      </w:r>
+    </w:p>
+    <w:p>
+      <w:pPr>
+        <w:pStyle w:val="Body"/>
+      </w:pPr>
+      <w:r>
+        <w:t>importaciones hasta forzar un coeficiente de distancia negativo. No se hizo,</w:t>
+      </w:r>
+    </w:p>
+    <w:p>
+      <w:pPr>
+        <w:pStyle w:val="Body"/>
+      </w:pPr>
+      <w:r>
+        <w:t>porque los residuos no señalan a ningún hub de tránsito, y la explicación</w:t>
+      </w:r>
+    </w:p>
+    <w:p>
+      <w:pPr>
+        <w:pStyle w:val="Body"/>
+      </w:pPr>
+      <w:r>
+        <w:t>alternativa (concentración real en manufactura asiática) es más simple y</w:t>
+      </w:r>
+    </w:p>
+    <w:p>
+      <w:pPr>
+        <w:pStyle w:val="Body"/>
+      </w:pPr>
+      <w:r>
+        <w:t>mejor documentada que inventar una corrección adicional.</w:t>
+      </w:r>
+    </w:p>
+    <w:p>
+      <w:pPr>
+        <w:spacing w:after="40"/>
+      </w:pPr>
+    </w:p>
+    <w:p>
+      <w:pPr>
+        <w:pStyle w:val="Body"/>
+      </w:pPr>
+      <w:r>
+        <w:t>Este patrón no es exclusivo de Perú: es un problema conocido en la</w:t>
+      </w:r>
+    </w:p>
+    <w:p>
+      <w:pPr>
+        <w:pStyle w:val="Body"/>
+      </w:pPr>
+      <w:r>
+        <w:t>literatura de gravedad para economías exportadoras de recursos naturales</w:t>
+      </w:r>
+    </w:p>
+    <w:p>
+      <w:pPr>
+        <w:pStyle w:val="Body"/>
+      </w:pPr>
+      <w:r>
+        <w:t>(Chile con cobre, los países del Golfo con petróleo, la República Democrática</w:t>
+      </w:r>
+    </w:p>
+    <w:p>
+      <w:pPr>
+        <w:pStyle w:val="Body"/>
+      </w:pPr>
+      <w:r>
+        <w:t>del Congo con cobalto). El aporte de este ejercicio es documentar el</w:t>
+      </w:r>
+    </w:p>
+    <w:p>
+      <w:pPr>
+        <w:pStyle w:val="Body"/>
+      </w:pPr>
+      <w:r>
+        <w:t>procedimiento completo y reproducible —diagnóstico de residuos, filtro por</w:t>
+      </w:r>
+    </w:p>
+    <w:p>
+      <w:pPr>
+        <w:pStyle w:val="Body"/>
+      </w:pPr>
+      <w:r>
+        <w:t>producto declarado a priori, filtro por país con lista estándar de la</w:t>
+      </w:r>
+    </w:p>
+    <w:p>
+      <w:pPr>
+        <w:pStyle w:val="Body"/>
+      </w:pPr>
+      <w:r>
+        <w:t>literatura, el punto explícito en el que se decide dejar de excluir</w:t>
+      </w:r>
+    </w:p>
+    <w:p>
+      <w:pPr>
+        <w:pStyle w:val="Body"/>
+      </w:pPr>
+      <w:r>
+        <w:t>observaciones, y la verificación simétrica del lado importador— en un caso</w:t>
+      </w:r>
+    </w:p>
+    <w:p>
+      <w:pPr>
+        <w:pStyle w:val="Body"/>
+      </w:pPr>
+      <w:r>
+        <w:t>real con datos públicos verificables.</w:t>
+      </w:r>
+    </w:p>
+    <w:p>
+      <w:pPr>
+        <w:spacing w:after="40"/>
+      </w:pPr>
+    </w:p>
+    <w:p>
+      <w:pPr>
+        <w:pStyle w:val="SectionHdr"/>
+        <w:spacing w:before="280" w:after="40"/>
+        <w:shd w:val="clear" w:color="auto" w:fill="1A3050"/>
+      </w:pPr>
+      <w:r>
+        <w:rPr>
+          <w:b/>
+          <w:color w:val="FFFFFF"/>
+          <w:sz w:val="22"/>
+        </w:rPr>
+        <w:t>7. Limitaciones</w:t>
+      </w:r>
+    </w:p>
+    <w:p>
+      <w:pPr>
+        <w:spacing w:before="0" w:after="80"/>
+        <w:pBdr>
+          <w:bottom w:val="single" w:sz="12" w:space="1" w:color="1A3050"/>
+        </w:pBdr>
+      </w:pPr>
+    </w:p>
+    <w:p>
+      <w:pPr>
+        <w:spacing w:after="40"/>
+      </w:pPr>
+    </w:p>
+    <w:p>
+      <w:pPr>
         <w:pStyle w:val="Bullet"/>
         <w:ind w:left="400" w:hanging="280"/>
       </w:pPr>
@@ -3755,7 +5925,7 @@
         <w:ind w:left="400" w:hanging="280"/>
       </w:pPr>
       <w:r>
-        <w:t>•  El panel cubre solo el lado exportador de Perú (2015-2024); no se estimó</w:t>
+        <w:t>•  El panel cubre exportaciones e importaciones por separado (2015-2024); no</w:t>
       </w:r>
     </w:p>
     <w:p>
@@ -3763,7 +5933,72 @@
         <w:pStyle w:val="Body"/>
       </w:pPr>
       <w:r>
-        <w:t>el modelo simétrico para importaciones ni para el comercio bilateral neto.</w:t>
+        <w:t>se estimó un modelo conjunto del comercio bilateral neto (exporta menos</w:t>
+      </w:r>
+    </w:p>
+    <w:p>
+      <w:pPr>
+        <w:pStyle w:val="Body"/>
+      </w:pPr>
+      <w:r>
+        <w:t>importa), que requeriría una especificación distinta (la variable</w:t>
+      </w:r>
+    </w:p>
+    <w:p>
+      <w:pPr>
+        <w:pStyle w:val="Body"/>
+      </w:pPr>
+      <w:r>
+        <w:t>dependiente podría ser negativa, incompatible con PPML tal como se usó</w:t>
+      </w:r>
+    </w:p>
+    <w:p>
+      <w:pPr>
+        <w:pStyle w:val="Body"/>
+      </w:pPr>
+      <w:r>
+        <w:t>aquí).</w:t>
+      </w:r>
+    </w:p>
+    <w:p>
+      <w:pPr>
+        <w:pStyle w:val="Bullet"/>
+        <w:ind w:left="400" w:hanging="280"/>
+      </w:pPr>
+      <w:r>
+        <w:t>•  La explicación de la sección 5 para el signo de la distancia en</w:t>
+      </w:r>
+    </w:p>
+    <w:p>
+      <w:pPr>
+        <w:pStyle w:val="Body"/>
+      </w:pPr>
+      <w:r>
+        <w:t>importaciones (concentración real en manufactura asiática) es la lectura</w:t>
+      </w:r>
+    </w:p>
+    <w:p>
+      <w:pPr>
+        <w:pStyle w:val="Body"/>
+      </w:pPr>
+      <w:r>
+        <w:t>más simple consistente con los residuos observados, pero no se contrastó</w:t>
+      </w:r>
+    </w:p>
+    <w:p>
+      <w:pPr>
+        <w:pStyle w:val="Body"/>
+      </w:pPr>
+      <w:r>
+        <w:t>contra una hipótesis alternativa formal (ej. un modelo de cadenas de valor</w:t>
+      </w:r>
+    </w:p>
+    <w:p>
+      <w:pPr>
+        <w:pStyle w:val="Body"/>
+      </w:pPr>
+      <w:r>
+        <w:t>globales) — queda como lectura cualitativa, no como resultado probado.</w:t>
       </w:r>
     </w:p>
     <w:p>
@@ -4088,7 +6323,15 @@
         <w:ind w:left="400" w:hanging="280"/>
       </w:pPr>
       <w:r>
-        <w:t>•  data/raw/panel_bilateral_peru_2015_2024.json — extracción cruda de Neon.</w:t>
+        <w:t>•  data/raw/panel_bilateral_peru_2015_2024.json — extracción cruda de</w:t>
+      </w:r>
+    </w:p>
+    <w:p>
+      <w:pPr>
+        <w:pStyle w:val="Body"/>
+      </w:pPr>
+      <w:r>
+        <w:t>exportaciones, desde Neon.</w:t>
       </w:r>
     </w:p>
     <w:p>
@@ -4097,7 +6340,7 @@
         <w:ind w:left="400" w:hanging="280"/>
       </w:pPr>
       <w:r>
-        <w:t>•  data/procesado/panel_final_estimacion.csv — panel final usado en la</w:t>
+        <w:t>•  data/raw/panel_bilateral_peru_importaciones_2015_2024.json — extracción</w:t>
       </w:r>
     </w:p>
     <w:p>
@@ -4105,7 +6348,7 @@
         <w:pStyle w:val="Body"/>
       </w:pPr>
       <w:r>
-        <w:t>especificación 3 (1,847 filas).</w:t>
+        <w:t>cruda de importaciones.</w:t>
       </w:r>
     </w:p>
     <w:p>
@@ -4114,7 +6357,7 @@
         <w:ind w:left="400" w:hanging="280"/>
       </w:pPr>
       <w:r>
-        <w:t>•  data/procesado/tabla_comparativa_especificaciones.csv — las tres</w:t>
+        <w:t>•  data/procesado/panel_final_estimacion_exportaciones.csv y</w:t>
       </w:r>
     </w:p>
     <w:p>
@@ -4122,7 +6365,15 @@
         <w:pStyle w:val="Body"/>
       </w:pPr>
       <w:r>
-        <w:t>especificaciones con todos los coeficientes.</w:t>
+        <w:t>_importaciones.csv — paneles finales de cada especificación 3 (1,847</w:t>
+      </w:r>
+    </w:p>
+    <w:p>
+      <w:pPr>
+        <w:pStyle w:val="Body"/>
+      </w:pPr>
+      <w:r>
+        <w:t>filas cada uno).</w:t>
       </w:r>
     </w:p>
     <w:p>
@@ -4131,7 +6382,24 @@
         <w:ind w:left="400" w:hanging="280"/>
       </w:pPr>
       <w:r>
-        <w:t>•  scripts/estimar_gravedad.py — script que reproduce las tres</w:t>
+        <w:t>•  data/procesado/tabla_comparativa_especificaciones.csv — las seis</w:t>
+      </w:r>
+    </w:p>
+    <w:p>
+      <w:pPr>
+        <w:pStyle w:val="Body"/>
+      </w:pPr>
+      <w:r>
+        <w:t>especificaciones (3 exporta + 3 importa) con todos los coeficientes.</w:t>
+      </w:r>
+    </w:p>
+    <w:p>
+      <w:pPr>
+        <w:pStyle w:val="Bullet"/>
+        <w:ind w:left="400" w:hanging="280"/>
+      </w:pPr>
+      <w:r>
+        <w:t>•  scripts/estimar_gravedad.py — script que reproduce las seis</w:t>
       </w:r>
     </w:p>
     <w:p>
@@ -4156,7 +6424,7 @@
         <w:pStyle w:val="Body"/>
       </w:pPr>
       <w:r>
-        <w:t>recorrido, ejecutado con outputs reales.</w:t>
+        <w:t>recorrido (exportaciones), ejecutado con outputs reales.</w:t>
       </w:r>
     </w:p>
     <w:p>

</xml_diff>

<commit_message>
feat(gravedad-comercio-bilateral-peru): version formateada para Estudios Economicos (BCRP)
Agrega Paper-BCRP-Estudios-Economicos.{md,docx}, reformateado segun las
normas de autores verificadas en vivo de la Revista Estudios Economicos
del BCRP: espanol, A4, doble espacio, cuadros numerados consecutivamente
("Cuadro N", no "Tabla"), formato academico estandar sin diseno de marca
(Times New Roman, sin banners de color). Titulo academico neutro distinto
del titulo narrativo de la version de difusion general. Incluye resumen,
palabras clave y codigos JEL (F14, F10, F15, C21).

Corrige ademas una referencia desactualizada en el anexo de ambos papers
(el notebook ya cubre exportaciones E importaciones, no solo exportaciones).
</commit_message>
<xml_diff>
--- a/investigaciones/gravedad-comercio-bilateral-peru/paper/Paper-Gravedad-Comercio-Bilateral-Peru-2015-2024.docx
+++ b/investigaciones/gravedad-comercio-bilateral-peru/paper/Paper-Gravedad-Comercio-Bilateral-Peru-2015-2024.docx
@@ -6424,7 +6424,15 @@
         <w:pStyle w:val="Body"/>
       </w:pPr>
       <w:r>
-        <w:t>recorrido (exportaciones), ejecutado con outputs reales.</w:t>
+        <w:t>recorrido para ambos lados (Parte 1: exportaciones, Parte 2: importaciones),</w:t>
+      </w:r>
+    </w:p>
+    <w:p>
+      <w:pPr>
+        <w:pStyle w:val="Body"/>
+      </w:pPr>
+      <w:r>
+        <w:t>ejecutado con outputs reales.</w:t>
       </w:r>
     </w:p>
     <w:p>

</xml_diff>